<commit_message>
Marilyn Monroe: revisão crítica da Parte 5
Co-Authored-By: Claude Opus 5.5 <noreply@anthropic.com>
Claude-Session: https://claude.ai/code/session_01MJjUEEZrxQDEUifKK2vj9g
</commit_message>
<xml_diff>
--- a/roteiros/marilyn-monroe/MarilynMonroe_Parte5.docx
+++ b/roteiros/marilyn-monroe/MarilynMonroe_Parte5.docx
@@ -87,7 +87,7 @@
         <w:rPr>
           <w:color w:val="C00000"/>
         </w:rPr>
-        <w:t>Guarde essa gaveta na sua cabeça. Porque ela é o último objeto dessa história. E o que aconteceu ao redor dela, nas décadas seguintes, é a parte mais repugnante de tudo o que você ouviu até aqui.</w:t>
+        <w:t>Guarde essa gaveta na sua cabeça. Porque é ao redor dela que essa história termina. E o que aconteceu ao redor dela, nas décadas seguintes, é a parte mais repugnante de tudo o que você ouviu até aqui.</w:t>
       </w:r>
     </w:p>
     <w:p>
@@ -183,7 +183,7 @@
         <w:rPr>
           <w:color w:val="000000"/>
         </w:rPr>
-        <w:t>Deixou uma pensão para a mãe, Gladys, que ainda estava internada. Do que sobrasse, um quarto ficou para a psiquiatra Marianne Kris, justamente a médica que a tinha levado para a Payne Whitney.</w:t>
+        <w:t>Deixou uma pensão para a mãe, Gladys, que ainda estava internada. Do que sobrasse, um quarto ficou para a psiquiatra Marianne Kris, justamente a médica que, semanas depois, a levaria para a Payne Whitney.</w:t>
       </w:r>
     </w:p>
     <w:p>
@@ -215,7 +215,7 @@
         <w:rPr>
           <w:color w:val="000000"/>
         </w:rPr>
-        <w:t>A primeira a perceber isso foi a mesma revista de sempre. Em janeiro de mil novecentos e sessenta e quatro, um ano e meio depois do enterro, a Playboy publicou as fotos da piscina. Marilyn já não podia escolher quais imagens iam aparecer.</w:t>
+        <w:t>Uma das primeiras a perceber isso foi a mesma revista de sempre. Em janeiro de mil novecentos e sessenta e quatro, um ano e meio depois do enterro, a Playboy publicou as fotos da piscina. Marilyn já não podia escolher quais imagens iam aparecer.</w:t>
       </w:r>
     </w:p>
     <w:p>
@@ -287,7 +287,7 @@
         <w:rPr>
           <w:color w:val="000000"/>
         </w:rPr>
-        <w:t>Anos depois, os direitos de uso da imagem de Marilyn foram vendidos a uma empresa de licenciamento de marcas por dezenas de milhões de dólares.</w:t>
+        <w:t>Em dois mil e dez, os direitos de uso da imagem de Marilyn foram vendidos a uma empresa de licenciamento de marcas por dezenas de milhões de dólares.</w:t>
       </w:r>
     </w:p>
     <w:p>
@@ -503,7 +503,7 @@
         <w:rPr>
           <w:color w:val="000000"/>
         </w:rPr>
-        <w:t>Em dois mil e vinte e dois, um documentário francês comparou o DNA de um fio de cabelo de Marilyn com o de uma neta de Gifford.</w:t>
+        <w:t>Em dois mil e vinte e dois, um documentário francês comparou o DNA de um fio de cabelo de Marilyn com o de um descendente de Gifford.</w:t>
       </w:r>
     </w:p>
     <w:p>
@@ -591,7 +591,7 @@
         <w:rPr>
           <w:color w:val="000000"/>
         </w:rPr>
-        <w:t>Cada objeto conta um pedaço da mesma história. A história de uma menina que ninguém quis. Que foi passada de casa em casa e vendida em fotos por quem nunca a conheceu. E que, mesmo depois de morta, continua dando dinheiro a pessoas que nunca a conheceram.</w:t>
+        <w:t>Cada objeto conta um pedaço da mesma história. A história de uma menina que ninguém quis. Que foi passada de casa em casa e vendida em fotos por quem nunca a conheceu. E que, mesmo depois de morta, continua enriquecendo estranhos.</w:t>
       </w:r>
     </w:p>
     <w:p>

</xml_diff>